<commit_message>
feat: dashboard, staff management, attendance, adhoc entries, settlement, transaction review
</commit_message>
<xml_diff>
--- a/docs:/GRIHAZ-BRIEF.docx
+++ b/docs:/GRIHAZ-BRIEF.docx
@@ -90,12 +90,6 @@
         <w:gridCol w:w="6360"/>
       </w:tblGrid>
       <w:tr>
-        <w:tblPrEx>
-          <w:tblCellMar>
-            <w:top w:w="0" w:type="dxa"/>
-            <w:bottom w:w="0" w:type="dxa"/>
-          </w:tblCellMar>
-        </w:tblPrEx>
         <w:tc>
           <w:tcPr>
             <w:tcW w:w="3000" w:type="dxa"/>
@@ -155,12 +149,6 @@
         </w:tc>
       </w:tr>
       <w:tr>
-        <w:tblPrEx>
-          <w:tblCellMar>
-            <w:top w:w="0" w:type="dxa"/>
-            <w:bottom w:w="0" w:type="dxa"/>
-          </w:tblCellMar>
-        </w:tblPrEx>
         <w:tc>
           <w:tcPr>
             <w:tcW w:w="3000" w:type="dxa"/>
@@ -218,12 +206,6 @@
         </w:tc>
       </w:tr>
       <w:tr>
-        <w:tblPrEx>
-          <w:tblCellMar>
-            <w:top w:w="0" w:type="dxa"/>
-            <w:bottom w:w="0" w:type="dxa"/>
-          </w:tblCellMar>
-        </w:tblPrEx>
         <w:tc>
           <w:tcPr>
             <w:tcW w:w="3000" w:type="dxa"/>
@@ -281,12 +263,6 @@
         </w:tc>
       </w:tr>
       <w:tr>
-        <w:tblPrEx>
-          <w:tblCellMar>
-            <w:top w:w="0" w:type="dxa"/>
-            <w:bottom w:w="0" w:type="dxa"/>
-          </w:tblCellMar>
-        </w:tblPrEx>
         <w:tc>
           <w:tcPr>
             <w:tcW w:w="3000" w:type="dxa"/>
@@ -344,12 +320,6 @@
         </w:tc>
       </w:tr>
       <w:tr>
-        <w:tblPrEx>
-          <w:tblCellMar>
-            <w:top w:w="0" w:type="dxa"/>
-            <w:bottom w:w="0" w:type="dxa"/>
-          </w:tblCellMar>
-        </w:tblPrEx>
         <w:tc>
           <w:tcPr>
             <w:tcW w:w="3000" w:type="dxa"/>
@@ -423,12 +393,6 @@
         </w:tc>
       </w:tr>
       <w:tr>
-        <w:tblPrEx>
-          <w:tblCellMar>
-            <w:top w:w="0" w:type="dxa"/>
-            <w:bottom w:w="0" w:type="dxa"/>
-          </w:tblCellMar>
-        </w:tblPrEx>
         <w:tc>
           <w:tcPr>
             <w:tcW w:w="3000" w:type="dxa"/>
@@ -486,12 +450,6 @@
         </w:tc>
       </w:tr>
       <w:tr>
-        <w:tblPrEx>
-          <w:tblCellMar>
-            <w:top w:w="0" w:type="dxa"/>
-            <w:bottom w:w="0" w:type="dxa"/>
-          </w:tblCellMar>
-        </w:tblPrEx>
         <w:tc>
           <w:tcPr>
             <w:tcW w:w="3000" w:type="dxa"/>
@@ -549,12 +507,6 @@
         </w:tc>
       </w:tr>
       <w:tr>
-        <w:tblPrEx>
-          <w:tblCellMar>
-            <w:top w:w="0" w:type="dxa"/>
-            <w:bottom w:w="0" w:type="dxa"/>
-          </w:tblCellMar>
-        </w:tblPrEx>
         <w:tc>
           <w:tcPr>
             <w:tcW w:w="3000" w:type="dxa"/>
@@ -612,12 +564,6 @@
         </w:tc>
       </w:tr>
       <w:tr>
-        <w:tblPrEx>
-          <w:tblCellMar>
-            <w:top w:w="0" w:type="dxa"/>
-            <w:bottom w:w="0" w:type="dxa"/>
-          </w:tblCellMar>
-        </w:tblPrEx>
         <w:tc>
           <w:tcPr>
             <w:tcW w:w="3000" w:type="dxa"/>
@@ -675,12 +621,6 @@
         </w:tc>
       </w:tr>
       <w:tr>
-        <w:tblPrEx>
-          <w:tblCellMar>
-            <w:top w:w="0" w:type="dxa"/>
-            <w:bottom w:w="0" w:type="dxa"/>
-          </w:tblCellMar>
-        </w:tblPrEx>
         <w:tc>
           <w:tcPr>
             <w:tcW w:w="3000" w:type="dxa"/>
@@ -993,12 +933,6 @@
         <w:gridCol w:w="6360"/>
       </w:tblGrid>
       <w:tr>
-        <w:tblPrEx>
-          <w:tblCellMar>
-            <w:top w:w="0" w:type="dxa"/>
-            <w:bottom w:w="0" w:type="dxa"/>
-          </w:tblCellMar>
-        </w:tblPrEx>
         <w:tc>
           <w:tcPr>
             <w:tcW w:w="3000" w:type="dxa"/>
@@ -1056,12 +990,6 @@
         </w:tc>
       </w:tr>
       <w:tr>
-        <w:tblPrEx>
-          <w:tblCellMar>
-            <w:top w:w="0" w:type="dxa"/>
-            <w:bottom w:w="0" w:type="dxa"/>
-          </w:tblCellMar>
-        </w:tblPrEx>
         <w:tc>
           <w:tcPr>
             <w:tcW w:w="3000" w:type="dxa"/>
@@ -1119,12 +1047,6 @@
         </w:tc>
       </w:tr>
       <w:tr>
-        <w:tblPrEx>
-          <w:tblCellMar>
-            <w:top w:w="0" w:type="dxa"/>
-            <w:bottom w:w="0" w:type="dxa"/>
-          </w:tblCellMar>
-        </w:tblPrEx>
         <w:tc>
           <w:tcPr>
             <w:tcW w:w="3000" w:type="dxa"/>
@@ -1182,12 +1104,6 @@
         </w:tc>
       </w:tr>
       <w:tr>
-        <w:tblPrEx>
-          <w:tblCellMar>
-            <w:top w:w="0" w:type="dxa"/>
-            <w:bottom w:w="0" w:type="dxa"/>
-          </w:tblCellMar>
-        </w:tblPrEx>
         <w:tc>
           <w:tcPr>
             <w:tcW w:w="3000" w:type="dxa"/>
@@ -1245,12 +1161,6 @@
         </w:tc>
       </w:tr>
       <w:tr>
-        <w:tblPrEx>
-          <w:tblCellMar>
-            <w:top w:w="0" w:type="dxa"/>
-            <w:bottom w:w="0" w:type="dxa"/>
-          </w:tblCellMar>
-        </w:tblPrEx>
         <w:tc>
           <w:tcPr>
             <w:tcW w:w="3000" w:type="dxa"/>
@@ -1308,12 +1218,6 @@
         </w:tc>
       </w:tr>
       <w:tr>
-        <w:tblPrEx>
-          <w:tblCellMar>
-            <w:top w:w="0" w:type="dxa"/>
-            <w:bottom w:w="0" w:type="dxa"/>
-          </w:tblCellMar>
-        </w:tblPrEx>
         <w:tc>
           <w:tcPr>
             <w:tcW w:w="3000" w:type="dxa"/>
@@ -1382,12 +1286,6 @@
         </w:tc>
       </w:tr>
       <w:tr>
-        <w:tblPrEx>
-          <w:tblCellMar>
-            <w:top w:w="0" w:type="dxa"/>
-            <w:bottom w:w="0" w:type="dxa"/>
-          </w:tblCellMar>
-        </w:tblPrEx>
         <w:tc>
           <w:tcPr>
             <w:tcW w:w="3000" w:type="dxa"/>
@@ -1461,12 +1359,6 @@
         </w:tc>
       </w:tr>
       <w:tr>
-        <w:tblPrEx>
-          <w:tblCellMar>
-            <w:top w:w="0" w:type="dxa"/>
-            <w:bottom w:w="0" w:type="dxa"/>
-          </w:tblCellMar>
-        </w:tblPrEx>
         <w:tc>
           <w:tcPr>
             <w:tcW w:w="3000" w:type="dxa"/>
@@ -1849,12 +1741,6 @@
         <w:gridCol w:w="6360"/>
       </w:tblGrid>
       <w:tr>
-        <w:tblPrEx>
-          <w:tblCellMar>
-            <w:top w:w="0" w:type="dxa"/>
-            <w:bottom w:w="0" w:type="dxa"/>
-          </w:tblCellMar>
-        </w:tblPrEx>
         <w:tc>
           <w:tcPr>
             <w:tcW w:w="3000" w:type="dxa"/>
@@ -1928,12 +1814,6 @@
         </w:tc>
       </w:tr>
       <w:tr>
-        <w:tblPrEx>
-          <w:tblCellMar>
-            <w:top w:w="0" w:type="dxa"/>
-            <w:bottom w:w="0" w:type="dxa"/>
-          </w:tblCellMar>
-        </w:tblPrEx>
         <w:tc>
           <w:tcPr>
             <w:tcW w:w="3000" w:type="dxa"/>
@@ -2007,12 +1887,6 @@
         </w:tc>
       </w:tr>
       <w:tr>
-        <w:tblPrEx>
-          <w:tblCellMar>
-            <w:top w:w="0" w:type="dxa"/>
-            <w:bottom w:w="0" w:type="dxa"/>
-          </w:tblCellMar>
-        </w:tblPrEx>
         <w:tc>
           <w:tcPr>
             <w:tcW w:w="3000" w:type="dxa"/>
@@ -2144,12 +2018,6 @@
         <w:gridCol w:w="6360"/>
       </w:tblGrid>
       <w:tr>
-        <w:tblPrEx>
-          <w:tblCellMar>
-            <w:top w:w="0" w:type="dxa"/>
-            <w:bottom w:w="0" w:type="dxa"/>
-          </w:tblCellMar>
-        </w:tblPrEx>
         <w:tc>
           <w:tcPr>
             <w:tcW w:w="3000" w:type="dxa"/>
@@ -2232,12 +2100,6 @@
         </w:tc>
       </w:tr>
       <w:tr>
-        <w:tblPrEx>
-          <w:tblCellMar>
-            <w:top w:w="0" w:type="dxa"/>
-            <w:bottom w:w="0" w:type="dxa"/>
-          </w:tblCellMar>
-        </w:tblPrEx>
         <w:tc>
           <w:tcPr>
             <w:tcW w:w="3000" w:type="dxa"/>
@@ -2338,12 +2200,6 @@
         </w:tc>
       </w:tr>
       <w:tr>
-        <w:tblPrEx>
-          <w:tblCellMar>
-            <w:top w:w="0" w:type="dxa"/>
-            <w:bottom w:w="0" w:type="dxa"/>
-          </w:tblCellMar>
-        </w:tblPrEx>
         <w:tc>
           <w:tcPr>
             <w:tcW w:w="3000" w:type="dxa"/>
@@ -2490,12 +2346,6 @@
         </w:tc>
       </w:tr>
       <w:tr>
-        <w:tblPrEx>
-          <w:tblCellMar>
-            <w:top w:w="0" w:type="dxa"/>
-            <w:bottom w:w="0" w:type="dxa"/>
-          </w:tblCellMar>
-        </w:tblPrEx>
         <w:tc>
           <w:tcPr>
             <w:tcW w:w="3000" w:type="dxa"/>
@@ -2642,12 +2492,6 @@
         </w:tc>
       </w:tr>
       <w:tr>
-        <w:tblPrEx>
-          <w:tblCellMar>
-            <w:top w:w="0" w:type="dxa"/>
-            <w:bottom w:w="0" w:type="dxa"/>
-          </w:tblCellMar>
-        </w:tblPrEx>
         <w:tc>
           <w:tcPr>
             <w:tcW w:w="3000" w:type="dxa"/>
@@ -2764,12 +2608,6 @@
         </w:tc>
       </w:tr>
       <w:tr>
-        <w:tblPrEx>
-          <w:tblCellMar>
-            <w:top w:w="0" w:type="dxa"/>
-            <w:bottom w:w="0" w:type="dxa"/>
-          </w:tblCellMar>
-        </w:tblPrEx>
         <w:tc>
           <w:tcPr>
             <w:tcW w:w="3000" w:type="dxa"/>
@@ -3092,12 +2930,6 @@
         <w:gridCol w:w="6360"/>
       </w:tblGrid>
       <w:tr>
-        <w:tblPrEx>
-          <w:tblCellMar>
-            <w:top w:w="0" w:type="dxa"/>
-            <w:bottom w:w="0" w:type="dxa"/>
-          </w:tblCellMar>
-        </w:tblPrEx>
         <w:tc>
           <w:tcPr>
             <w:tcW w:w="3000" w:type="dxa"/>
@@ -3155,12 +2987,6 @@
         </w:tc>
       </w:tr>
       <w:tr>
-        <w:tblPrEx>
-          <w:tblCellMar>
-            <w:top w:w="0" w:type="dxa"/>
-            <w:bottom w:w="0" w:type="dxa"/>
-          </w:tblCellMar>
-        </w:tblPrEx>
         <w:tc>
           <w:tcPr>
             <w:tcW w:w="3000" w:type="dxa"/>
@@ -3218,12 +3044,6 @@
         </w:tc>
       </w:tr>
       <w:tr>
-        <w:tblPrEx>
-          <w:tblCellMar>
-            <w:top w:w="0" w:type="dxa"/>
-            <w:bottom w:w="0" w:type="dxa"/>
-          </w:tblCellMar>
-        </w:tblPrEx>
         <w:tc>
           <w:tcPr>
             <w:tcW w:w="3000" w:type="dxa"/>
@@ -3297,12 +3117,6 @@
         </w:tc>
       </w:tr>
       <w:tr>
-        <w:tblPrEx>
-          <w:tblCellMar>
-            <w:top w:w="0" w:type="dxa"/>
-            <w:bottom w:w="0" w:type="dxa"/>
-          </w:tblCellMar>
-        </w:tblPrEx>
         <w:tc>
           <w:tcPr>
             <w:tcW w:w="3000" w:type="dxa"/>
@@ -3392,12 +3206,6 @@
         </w:tc>
       </w:tr>
       <w:tr>
-        <w:tblPrEx>
-          <w:tblCellMar>
-            <w:top w:w="0" w:type="dxa"/>
-            <w:bottom w:w="0" w:type="dxa"/>
-          </w:tblCellMar>
-        </w:tblPrEx>
         <w:tc>
           <w:tcPr>
             <w:tcW w:w="3000" w:type="dxa"/>
@@ -3455,12 +3263,6 @@
         </w:tc>
       </w:tr>
       <w:tr>
-        <w:tblPrEx>
-          <w:tblCellMar>
-            <w:top w:w="0" w:type="dxa"/>
-            <w:bottom w:w="0" w:type="dxa"/>
-          </w:tblCellMar>
-        </w:tblPrEx>
         <w:tc>
           <w:tcPr>
             <w:tcW w:w="3000" w:type="dxa"/>
@@ -3518,12 +3320,6 @@
         </w:tc>
       </w:tr>
       <w:tr>
-        <w:tblPrEx>
-          <w:tblCellMar>
-            <w:top w:w="0" w:type="dxa"/>
-            <w:bottom w:w="0" w:type="dxa"/>
-          </w:tblCellMar>
-        </w:tblPrEx>
         <w:tc>
           <w:tcPr>
             <w:tcW w:w="3000" w:type="dxa"/>
@@ -3590,12 +3386,6 @@
         </w:tc>
       </w:tr>
       <w:tr>
-        <w:tblPrEx>
-          <w:tblCellMar>
-            <w:top w:w="0" w:type="dxa"/>
-            <w:bottom w:w="0" w:type="dxa"/>
-          </w:tblCellMar>
-        </w:tblPrEx>
         <w:tc>
           <w:tcPr>
             <w:tcW w:w="3000" w:type="dxa"/>
@@ -3892,12 +3682,6 @@
         <w:gridCol w:w="6360"/>
       </w:tblGrid>
       <w:tr>
-        <w:tblPrEx>
-          <w:tblCellMar>
-            <w:top w:w="0" w:type="dxa"/>
-            <w:bottom w:w="0" w:type="dxa"/>
-          </w:tblCellMar>
-        </w:tblPrEx>
         <w:tc>
           <w:tcPr>
             <w:tcW w:w="3000" w:type="dxa"/>
@@ -3955,12 +3739,6 @@
         </w:tc>
       </w:tr>
       <w:tr>
-        <w:tblPrEx>
-          <w:tblCellMar>
-            <w:top w:w="0" w:type="dxa"/>
-            <w:bottom w:w="0" w:type="dxa"/>
-          </w:tblCellMar>
-        </w:tblPrEx>
         <w:tc>
           <w:tcPr>
             <w:tcW w:w="3000" w:type="dxa"/>
@@ -4018,12 +3796,6 @@
         </w:tc>
       </w:tr>
       <w:tr>
-        <w:tblPrEx>
-          <w:tblCellMar>
-            <w:top w:w="0" w:type="dxa"/>
-            <w:bottom w:w="0" w:type="dxa"/>
-          </w:tblCellMar>
-        </w:tblPrEx>
         <w:tc>
           <w:tcPr>
             <w:tcW w:w="3000" w:type="dxa"/>
@@ -4081,12 +3853,6 @@
         </w:tc>
       </w:tr>
       <w:tr>
-        <w:tblPrEx>
-          <w:tblCellMar>
-            <w:top w:w="0" w:type="dxa"/>
-            <w:bottom w:w="0" w:type="dxa"/>
-          </w:tblCellMar>
-        </w:tblPrEx>
         <w:tc>
           <w:tcPr>
             <w:tcW w:w="3000" w:type="dxa"/>
@@ -4160,12 +3926,6 @@
         </w:tc>
       </w:tr>
       <w:tr>
-        <w:tblPrEx>
-          <w:tblCellMar>
-            <w:top w:w="0" w:type="dxa"/>
-            <w:bottom w:w="0" w:type="dxa"/>
-          </w:tblCellMar>
-        </w:tblPrEx>
         <w:tc>
           <w:tcPr>
             <w:tcW w:w="3000" w:type="dxa"/>
@@ -4255,12 +4015,6 @@
         </w:tc>
       </w:tr>
       <w:tr>
-        <w:tblPrEx>
-          <w:tblCellMar>
-            <w:top w:w="0" w:type="dxa"/>
-            <w:bottom w:w="0" w:type="dxa"/>
-          </w:tblCellMar>
-        </w:tblPrEx>
         <w:tc>
           <w:tcPr>
             <w:tcW w:w="3000" w:type="dxa"/>
@@ -4318,12 +4072,6 @@
         </w:tc>
       </w:tr>
       <w:tr>
-        <w:tblPrEx>
-          <w:tblCellMar>
-            <w:top w:w="0" w:type="dxa"/>
-            <w:bottom w:w="0" w:type="dxa"/>
-          </w:tblCellMar>
-        </w:tblPrEx>
         <w:tc>
           <w:tcPr>
             <w:tcW w:w="3000" w:type="dxa"/>
@@ -4381,12 +4129,6 @@
         </w:tc>
       </w:tr>
       <w:tr>
-        <w:tblPrEx>
-          <w:tblCellMar>
-            <w:top w:w="0" w:type="dxa"/>
-            <w:bottom w:w="0" w:type="dxa"/>
-          </w:tblCellMar>
-        </w:tblPrEx>
         <w:tc>
           <w:tcPr>
             <w:tcW w:w="3000" w:type="dxa"/>
@@ -4453,12 +4195,6 @@
         </w:tc>
       </w:tr>
       <w:tr>
-        <w:tblPrEx>
-          <w:tblCellMar>
-            <w:top w:w="0" w:type="dxa"/>
-            <w:bottom w:w="0" w:type="dxa"/>
-          </w:tblCellMar>
-        </w:tblPrEx>
         <w:tc>
           <w:tcPr>
             <w:tcW w:w="3000" w:type="dxa"/>

</xml_diff>

<commit_message>
feat: add Sync Now button to Gmail integration in Profile
</commit_message>
<xml_diff>
--- a/docs:/GRIHAZ-BRIEF.docx
+++ b/docs:/GRIHAZ-BRIEF.docx
@@ -74,7 +74,7 @@
           <w:sz w:val="20"/>
           <w:szCs w:val="20"/>
         </w:rPr>
-        <w:t xml:space="preserve">Version 1.4  |  April 2026  |  Rhyea / Advait Parnaik</w:t>
+        <w:t xml:space="preserve">Version 1.5  |  April 2026  |  Rhyea / Advait Parnaik</w:t>
       </w:r>
     </w:p>
     <w:p>
@@ -6476,6 +6476,471 @@
         </w:tc>
       </w:tr>
     </w:tbl>
+    <w:p>
+      <w:r>
+        <w:t xml:space="preserve"/>
+      </w:r>
+    </w:p>
+    <w:p>
+      <w:pPr>
+        <w:pStyle w:val="Heading2"/>
+      </w:pPr>
+      <w:r>
+        <w:t xml:space="preserve">April 2026 — Session 2</w:t>
+      </w:r>
+    </w:p>
+    <w:tbl>
+      <w:tblPr>
+        <w:tblW w:type="dxa" w:w="9360"/>
+        <w:tblBorders>
+          <w:top w:val="single" w:color="auto" w:sz="4"/>
+          <w:left w:val="single" w:color="auto" w:sz="4"/>
+          <w:bottom w:val="single" w:color="auto" w:sz="4"/>
+          <w:right w:val="single" w:color="auto" w:sz="4"/>
+          <w:insideH w:val="single" w:color="auto" w:sz="4"/>
+          <w:insideV w:val="single" w:color="auto" w:sz="4"/>
+        </w:tblBorders>
+      </w:tblPr>
+      <w:tblGrid>
+        <w:gridCol w:w="2600"/>
+        <w:gridCol w:w="6760"/>
+      </w:tblGrid>
+      <w:tr>
+        <w:tc>
+          <w:tcPr>
+            <w:tcW w:type="dxa" w:w="2600"/>
+            <w:tcBorders>
+              <w:top w:val="single" w:color="CCCCCC" w:sz="1"/>
+              <w:left w:val="single" w:color="CCCCCC" w:sz="1"/>
+              <w:bottom w:val="single" w:color="CCCCCC" w:sz="1"/>
+              <w:right w:val="single" w:color="CCCCCC" w:sz="1"/>
+            </w:tcBorders>
+            <w:shd w:fill="F2F2F2" w:val="clear"/>
+            <w:tcMar>
+              <w:top w:type="dxa" w:w="80"/>
+              <w:left w:type="dxa" w:w="120"/>
+              <w:bottom w:type="dxa" w:w="80"/>
+              <w:right w:type="dxa" w:w="120"/>
+            </w:tcMar>
+          </w:tcPr>
+          <w:p>
+            <w:r>
+              <w:rPr>
+                <w:b/>
+                <w:color w:val="000000"/>
+              </w:rPr>
+              <w:t xml:space="preserve">Issue / Decision</w:t>
+            </w:r>
+          </w:p>
+        </w:tc>
+        <w:tc>
+          <w:tcPr>
+            <w:tcW w:type="dxa" w:w="6760"/>
+            <w:tcBorders>
+              <w:top w:val="single" w:color="CCCCCC" w:sz="1"/>
+              <w:left w:val="single" w:color="CCCCCC" w:sz="1"/>
+              <w:bottom w:val="single" w:color="CCCCCC" w:sz="1"/>
+              <w:right w:val="single" w:color="CCCCCC" w:sz="1"/>
+            </w:tcBorders>
+            <w:shd w:fill="F2F2F2" w:val="clear"/>
+            <w:tcMar>
+              <w:top w:type="dxa" w:w="80"/>
+              <w:left w:type="dxa" w:w="120"/>
+              <w:bottom w:type="dxa" w:w="80"/>
+              <w:right w:type="dxa" w:w="120"/>
+            </w:tcMar>
+          </w:tcPr>
+          <w:p>
+            <w:r>
+              <w:rPr>
+                <w:b/>
+                <w:color w:val="000000"/>
+              </w:rPr>
+              <w:t xml:space="preserve">Resolution</w:t>
+            </w:r>
+          </w:p>
+        </w:tc>
+      </w:tr>
+      <w:tr>
+        <w:tc>
+          <w:tcPr>
+            <w:tcW w:type="dxa" w:w="2600"/>
+            <w:tcBorders>
+              <w:top w:val="single" w:color="CCCCCC" w:sz="1"/>
+              <w:left w:val="single" w:color="CCCCCC" w:sz="1"/>
+              <w:bottom w:val="single" w:color="CCCCCC" w:sz="1"/>
+              <w:right w:val="single" w:color="CCCCCC" w:sz="1"/>
+            </w:tcBorders>
+            <w:shd w:fill="FFFFFF" w:val="clear"/>
+            <w:tcMar>
+              <w:top w:type="dxa" w:w="80"/>
+              <w:left w:type="dxa" w:w="120"/>
+              <w:bottom w:type="dxa" w:w="80"/>
+              <w:right w:type="dxa" w:w="120"/>
+            </w:tcMar>
+          </w:tcPr>
+          <w:p>
+            <w:r>
+              <w:rPr>
+                <w:b w:val="false"/>
+                <w:color w:val="000000"/>
+              </w:rPr>
+              <w:t xml:space="preserve">CLI linked to wrong Supabase project</w:t>
+            </w:r>
+          </w:p>
+        </w:tc>
+        <w:tc>
+          <w:tcPr>
+            <w:tcW w:type="dxa" w:w="6760"/>
+            <w:tcBorders>
+              <w:top w:val="single" w:color="CCCCCC" w:sz="1"/>
+              <w:left w:val="single" w:color="CCCCCC" w:sz="1"/>
+              <w:bottom w:val="single" w:color="CCCCCC" w:sz="1"/>
+              <w:right w:val="single" w:color="CCCCCC" w:sz="1"/>
+            </w:tcBorders>
+            <w:shd w:fill="FFFFFF" w:val="clear"/>
+            <w:tcMar>
+              <w:top w:type="dxa" w:w="80"/>
+              <w:left w:type="dxa" w:w="120"/>
+              <w:bottom w:type="dxa" w:w="80"/>
+              <w:right w:type="dxa" w:w="120"/>
+            </w:tcMar>
+          </w:tcPr>
+          <w:p>
+            <w:r>
+              <w:rPr>
+                <w:b w:val="false"/>
+                <w:color w:val="000000"/>
+              </w:rPr>
+              <w:t xml:space="preserve">All previous Edge Function deploys had gone to grihaz-prod instead of grihaz-dev. Fixed by re-running supabase link --project-ref guiuxbnhqbbhqeaavtsp. gmail-sync redeployed to grihaz-dev.</w:t>
+            </w:r>
+          </w:p>
+        </w:tc>
+      </w:tr>
+      <w:tr>
+        <w:tc>
+          <w:tcPr>
+            <w:tcW w:type="dxa" w:w="2600"/>
+            <w:tcBorders>
+              <w:top w:val="single" w:color="CCCCCC" w:sz="1"/>
+              <w:left w:val="single" w:color="CCCCCC" w:sz="1"/>
+              <w:bottom w:val="single" w:color="CCCCCC" w:sz="1"/>
+              <w:right w:val="single" w:color="CCCCCC" w:sz="1"/>
+            </w:tcBorders>
+            <w:shd w:fill="FFFFFF" w:val="clear"/>
+            <w:tcMar>
+              <w:top w:type="dxa" w:w="80"/>
+              <w:left w:type="dxa" w:w="120"/>
+              <w:bottom w:type="dxa" w:w="80"/>
+              <w:right w:type="dxa" w:w="120"/>
+            </w:tcMar>
+          </w:tcPr>
+          <w:p>
+            <w:r>
+              <w:rPr>
+                <w:b w:val="false"/>
+                <w:color w:val="000000"/>
+              </w:rPr>
+              <w:t xml:space="preserve">Gmail OAuth callback not saving connection</w:t>
+            </w:r>
+          </w:p>
+        </w:tc>
+        <w:tc>
+          <w:tcPr>
+            <w:tcW w:type="dxa" w:w="6760"/>
+            <w:tcBorders>
+              <w:top w:val="single" w:color="CCCCCC" w:sz="1"/>
+              <w:left w:val="single" w:color="CCCCCC" w:sz="1"/>
+              <w:bottom w:val="single" w:color="CCCCCC" w:sz="1"/>
+              <w:right w:val="single" w:color="CCCCCC" w:sz="1"/>
+            </w:tcBorders>
+            <w:shd w:fill="FFFFFF" w:val="clear"/>
+            <w:tcMar>
+              <w:top w:type="dxa" w:w="80"/>
+              <w:left w:type="dxa" w:w="120"/>
+              <w:bottom w:type="dxa" w:w="80"/>
+              <w:right w:type="dxa" w:w="120"/>
+            </w:tcMar>
+          </w:tcPr>
+          <w:p>
+            <w:r>
+              <w:rPr>
+                <w:b w:val="false"/>
+                <w:color w:val="000000"/>
+              </w:rPr>
+              <w:t xml:space="preserve">processPendingGmailCallback() was exported but never called. Fixed by calling it inside fetchHome() after session and home are confirmed. Also added session retry loop (10 attempts x 300ms) to handle race condition where Supabase session restores after the callback fires.</w:t>
+            </w:r>
+          </w:p>
+        </w:tc>
+      </w:tr>
+      <w:tr>
+        <w:tc>
+          <w:tcPr>
+            <w:tcW w:type="dxa" w:w="2600"/>
+            <w:tcBorders>
+              <w:top w:val="single" w:color="CCCCCC" w:sz="1"/>
+              <w:left w:val="single" w:color="CCCCCC" w:sz="1"/>
+              <w:bottom w:val="single" w:color="CCCCCC" w:sz="1"/>
+              <w:right w:val="single" w:color="CCCCCC" w:sz="1"/>
+            </w:tcBorders>
+            <w:shd w:fill="FFFFFF" w:val="clear"/>
+            <w:tcMar>
+              <w:top w:type="dxa" w:w="80"/>
+              <w:left w:type="dxa" w:w="120"/>
+              <w:bottom w:type="dxa" w:w="80"/>
+              <w:right w:type="dxa" w:w="120"/>
+            </w:tcMar>
+          </w:tcPr>
+          <w:p>
+            <w:r>
+              <w:rPr>
+                <w:b w:val="false"/>
+                <w:color w:val="000000"/>
+              </w:rPr>
+              <w:t xml:space="preserve">Edge Function 401 Unauthorized on staging</w:t>
+            </w:r>
+          </w:p>
+        </w:tc>
+        <w:tc>
+          <w:tcPr>
+            <w:tcW w:type="dxa" w:w="6760"/>
+            <w:tcBorders>
+              <w:top w:val="single" w:color="CCCCCC" w:sz="1"/>
+              <w:left w:val="single" w:color="CCCCCC" w:sz="1"/>
+              <w:bottom w:val="single" w:color="CCCCCC" w:sz="1"/>
+              <w:right w:val="single" w:color="CCCCCC" w:sz="1"/>
+            </w:tcBorders>
+            <w:shd w:fill="FFFFFF" w:val="clear"/>
+            <w:tcMar>
+              <w:top w:type="dxa" w:w="80"/>
+              <w:left w:type="dxa" w:w="120"/>
+              <w:bottom w:type="dxa" w:w="80"/>
+              <w:right w:type="dxa" w:w="120"/>
+            </w:tcMar>
+          </w:tcPr>
+          <w:p>
+            <w:r>
+              <w:rPr>
+                <w:b w:val="false"/>
+                <w:color w:val="000000"/>
+              </w:rPr>
+              <w:t xml:space="preserve">“Verify JWT with legacy secret” toggle was ON on grihaz-dev gmail-sync Edge Function. Turned off. Added supabase/functions/gmail-sync/config.toml with verify_jwt = false to persist this setting across future deploys.</w:t>
+            </w:r>
+          </w:p>
+        </w:tc>
+      </w:tr>
+      <w:tr>
+        <w:tc>
+          <w:tcPr>
+            <w:tcW w:type="dxa" w:w="2600"/>
+            <w:tcBorders>
+              <w:top w:val="single" w:color="CCCCCC" w:sz="1"/>
+              <w:left w:val="single" w:color="CCCCCC" w:sz="1"/>
+              <w:bottom w:val="single" w:color="CCCCCC" w:sz="1"/>
+              <w:right w:val="single" w:color="CCCCCC" w:sz="1"/>
+            </w:tcBorders>
+            <w:shd w:fill="FFFFFF" w:val="clear"/>
+            <w:tcMar>
+              <w:top w:type="dxa" w:w="80"/>
+              <w:left w:type="dxa" w:w="120"/>
+              <w:bottom w:type="dxa" w:w="80"/>
+              <w:right w:type="dxa" w:w="120"/>
+            </w:tcMar>
+          </w:tcPr>
+          <w:p>
+            <w:r>
+              <w:rPr>
+                <w:b w:val="false"/>
+                <w:color w:val="000000"/>
+              </w:rPr>
+              <w:t xml:space="preserve">redirect_uri mismatch on token exchange</w:t>
+            </w:r>
+          </w:p>
+        </w:tc>
+        <w:tc>
+          <w:tcPr>
+            <w:tcW w:type="dxa" w:w="6760"/>
+            <w:tcBorders>
+              <w:top w:val="single" w:color="CCCCCC" w:sz="1"/>
+              <w:left w:val="single" w:color="CCCCCC" w:sz="1"/>
+              <w:bottom w:val="single" w:color="CCCCCC" w:sz="1"/>
+              <w:right w:val="single" w:color="CCCCCC" w:sz="1"/>
+            </w:tcBorders>
+            <w:shd w:fill="FFFFFF" w:val="clear"/>
+            <w:tcMar>
+              <w:top w:type="dxa" w:w="80"/>
+              <w:left w:type="dxa" w:w="120"/>
+              <w:bottom w:type="dxa" w:w="80"/>
+              <w:right w:type="dxa" w:w="120"/>
+            </w:tcMar>
+          </w:tcPr>
+          <w:p>
+            <w:r>
+              <w:rPr>
+                <w:b w:val="false"/>
+                <w:color w:val="000000"/>
+              </w:rPr>
+              <w:t xml:space="preserve">APP_URL secret was hardcoded to one environment, causing mismatch when switching between localhost and staging. Fixed by passing redirect_uri from the frontend (window.location.origin + /auth/gmail/callback) in the connect request body. exchangeCodeForTokens() updated to accept redirectUri as a parameter.</w:t>
+            </w:r>
+          </w:p>
+        </w:tc>
+      </w:tr>
+      <w:tr>
+        <w:tc>
+          <w:tcPr>
+            <w:tcW w:type="dxa" w:w="2600"/>
+            <w:tcBorders>
+              <w:top w:val="single" w:color="CCCCCC" w:sz="1"/>
+              <w:left w:val="single" w:color="CCCCCC" w:sz="1"/>
+              <w:bottom w:val="single" w:color="CCCCCC" w:sz="1"/>
+              <w:right w:val="single" w:color="CCCCCC" w:sz="1"/>
+            </w:tcBorders>
+            <w:shd w:fill="FFFFFF" w:val="clear"/>
+            <w:tcMar>
+              <w:top w:type="dxa" w:w="80"/>
+              <w:left w:type="dxa" w:w="120"/>
+              <w:bottom w:type="dxa" w:w="80"/>
+              <w:right w:type="dxa" w:w="120"/>
+            </w:tcMar>
+          </w:tcPr>
+          <w:p>
+            <w:r>
+              <w:rPr>
+                <w:b w:val="false"/>
+                <w:color w:val="000000"/>
+              </w:rPr>
+              <w:t xml:space="preserve">Google OAuth policy violation blocking staging connect</w:t>
+            </w:r>
+          </w:p>
+        </w:tc>
+        <w:tc>
+          <w:tcPr>
+            <w:tcW w:type="dxa" w:w="6760"/>
+            <w:tcBorders>
+              <w:top w:val="single" w:color="CCCCCC" w:sz="1"/>
+              <w:left w:val="single" w:color="CCCCCC" w:sz="1"/>
+              <w:bottom w:val="single" w:color="CCCCCC" w:sz="1"/>
+              <w:right w:val="single" w:color="CCCCCC" w:sz="1"/>
+            </w:tcBorders>
+            <w:shd w:fill="FFFFFF" w:val="clear"/>
+            <w:tcMar>
+              <w:top w:type="dxa" w:w="80"/>
+              <w:left w:type="dxa" w:w="120"/>
+              <w:bottom w:type="dxa" w:w="80"/>
+              <w:right w:type="dxa" w:w="120"/>
+            </w:tcMar>
+          </w:tcPr>
+          <w:p>
+            <w:r>
+              <w:rPr>
+                <w:b w:val="false"/>
+                <w:color w:val="000000"/>
+              </w:rPr>
+              <w:t xml:space="preserve">Google blocks gmail.readonly scope token exchange when OAuth consent screen lacks a live privacy policy URL. Fixed by: (1) creating /privacy and /terms pages in the React app, (2) deploying to grihaz.rhyea.com (production domain added as Cloudflare Pages custom domain), (3) updating Google Cloud Console Branding with live URLs. Gmail connect works on localhost. Staging pending Google propagation (can take hours).</w:t>
+            </w:r>
+          </w:p>
+        </w:tc>
+      </w:tr>
+      <w:tr>
+        <w:tc>
+          <w:tcPr>
+            <w:tcW w:type="dxa" w:w="2600"/>
+            <w:tcBorders>
+              <w:top w:val="single" w:color="CCCCCC" w:sz="1"/>
+              <w:left w:val="single" w:color="CCCCCC" w:sz="1"/>
+              <w:bottom w:val="single" w:color="CCCCCC" w:sz="1"/>
+              <w:right w:val="single" w:color="CCCCCC" w:sz="1"/>
+            </w:tcBorders>
+            <w:shd w:fill="FFFFFF" w:val="clear"/>
+            <w:tcMar>
+              <w:top w:type="dxa" w:w="80"/>
+              <w:left w:type="dxa" w:w="120"/>
+              <w:bottom w:type="dxa" w:w="80"/>
+              <w:right w:type="dxa" w:w="120"/>
+            </w:tcMar>
+          </w:tcPr>
+          <w:p>
+            <w:r>
+              <w:rPr>
+                <w:b w:val="false"/>
+                <w:color w:val="000000"/>
+              </w:rPr>
+              <w:t xml:space="preserve">Privacy &amp; Terms pages added to Profile</w:t>
+            </w:r>
+          </w:p>
+        </w:tc>
+        <w:tc>
+          <w:tcPr>
+            <w:tcW w:type="dxa" w:w="6760"/>
+            <w:tcBorders>
+              <w:top w:val="single" w:color="CCCCCC" w:sz="1"/>
+              <w:left w:val="single" w:color="CCCCCC" w:sz="1"/>
+              <w:bottom w:val="single" w:color="CCCCCC" w:sz="1"/>
+              <w:right w:val="single" w:color="CCCCCC" w:sz="1"/>
+            </w:tcBorders>
+            <w:shd w:fill="FFFFFF" w:val="clear"/>
+            <w:tcMar>
+              <w:top w:type="dxa" w:w="80"/>
+              <w:left w:type="dxa" w:w="120"/>
+              <w:bottom w:type="dxa" w:w="80"/>
+              <w:right w:type="dxa" w:w="120"/>
+            </w:tcMar>
+          </w:tcPr>
+          <w:p>
+            <w:r>
+              <w:rPr>
+                <w:b w:val="false"/>
+                <w:color w:val="000000"/>
+              </w:rPr>
+              <w:t xml:space="preserve">Created src/pages/Privacy.jsx and src/pages/Terms.jsx. Routes handled via window.location.pathname check at top of App() (no React Router). Legal section in Profile replaced single “Legal” link with separate Privacy Policy and Terms of Service links pointing to /privacy and /terms. Deployed to all three branches.</w:t>
+            </w:r>
+          </w:p>
+        </w:tc>
+      </w:tr>
+    </w:tbl>
+    <w:p>
+      <w:pPr>
+        <w:pStyle w:val="Heading2"/>
+      </w:pPr>
+      <w:r>
+        <w:t xml:space="preserve">Pending / Next Session</w:t>
+      </w:r>
+    </w:p>
+    <w:p>
+      <w:r>
+        <w:t xml:space="preserve">1. Confirm Gmail connect works on staging once Google OAuth policy propagates (may take up to 24 hours from branding update).</w:t>
+      </w:r>
+    </w:p>
+    <w:p>
+      <w:r>
+        <w:t xml:space="preserve">2. Test sync — verify Zomato and Blinkit orders come through correctly alongside Amazon.</w:t>
+      </w:r>
+    </w:p>
+    <w:p>
+      <w:r>
+        <w:t xml:space="preserve">3. Debug cleanup: remove _sync_debug table and all debug inserts from gmail-sync Edge Function; revert maxResults from 50 back to 10 in runHistorySync; remove debug field from return statements.</w:t>
+      </w:r>
+    </w:p>
+    <w:p>
+      <w:r>
+        <w:t xml:space="preserve">4. Backlog: Manage Home navigation (back button should return to Profile, not main app; rename “Home settings &amp; Members” to “Manage Home”).</w:t>
+      </w:r>
+    </w:p>
+    <w:p>
+      <w:r>
+        <w:t xml:space="preserve">5. Backlog: ExpensePlatforms UX — ability to edit/add more sender emails to existing platform without removing it.</w:t>
+      </w:r>
+    </w:p>
+    <w:p>
+      <w:r>
+        <w:t xml:space="preserve">6. Backlog: Upgrade Resend to support noreply@grihaz.rhyea.com as subdomain sender.</w:t>
+      </w:r>
+    </w:p>
+    <w:p>
+      <w:r>
+        <w:t xml:space="preserve">7. Submit Google OAuth app for verification once Gmail connect is stable end-to-end.</w:t>
+      </w:r>
+    </w:p>
     <w:p>
       <w:r>
         <w:t xml:space="preserve"/>

</xml_diff>